<commit_message>
Final state: include runtime data, report, and architecture fix
</commit_message>
<xml_diff>
--- a/Project Report.docx
+++ b/Project Report.docx
@@ -14,78 +14,64 @@
           <w:b/>
           <w:bCs/>
         </w:rPr>
-        <w:t>Project Report</w:t>
-      </w:r>
-    </w:p>
-    <w:p>
-      <w:pPr>
-        <w:rPr>
-          <w:b/>
-          <w:bCs/>
-        </w:rPr>
-      </w:pPr>
-      <w:r>
-        <w:rPr>
-          <w:b/>
-          <w:bCs/>
-        </w:rPr>
-        <w:t xml:space="preserve">PPIT Project Phase 1 </w:t>
-      </w:r>
-    </w:p>
-    <w:p>
-      <w:r>
-        <w:pict w14:anchorId="475A3D26">
-          <v:rect id="_x0000_i1133" style="width:0;height:1.5pt" o:hralign="center" o:hrstd="t" o:hr="t" fillcolor="#a0a0a0" stroked="f"/>
-        </w:pict>
-      </w:r>
-      <w:r>
+        <w:t>Final Project Report</w:t>
+      </w:r>
+    </w:p>
+    <w:p>
+      <w:pPr>
+        <w:rPr>
+          <w:b/>
+          <w:bCs/>
+        </w:rPr>
+      </w:pPr>
+      <w:r>
+        <w:rPr>
+          <w:b/>
+          <w:bCs/>
+        </w:rPr>
+        <w:t>PPIT Project — Phase 1 and Phase 2</w:t>
+      </w:r>
+    </w:p>
+    <w:p>
+      <w:r>
+        <w:rPr>
+          <w:b w:val="0"/>
+        </w:rPr>
+        <w:t>Course: PPIT (Professional Practices in IT)</w:t>
         <w:br/>
-      </w:r>
-      <w:r>
-        <w:rPr>
-          <w:b/>
-          <w:bCs/>
-        </w:rPr>
-        <w:t>Course:</w:t>
-      </w:r>
-      <w:r>
-        <w:t xml:space="preserve"> PPIT</w:t>
-      </w:r>
-      <w:r>
+        <w:t>Group Members: Sarim Farooq, Hamid Ashraf, Abubakar Bilal</w:t>
         <w:br/>
-      </w:r>
-      <w:r>
-        <w:rPr>
-          <w:b/>
-          <w:bCs/>
-        </w:rPr>
-        <w:t>Group Members:</w:t>
-      </w:r>
-      <w:r>
-        <w:t xml:space="preserve"> </w:t>
-      </w:r>
-      <w:r>
-        <w:t>Sarim Farooq, Hamid Ashraf, Abubakar Bilal</w:t>
-      </w:r>
-      <w:r>
+        <w:t>Roll Numbers: 22I-0458, 22I-0510, 22I-0450</w:t>
         <w:br/>
-      </w:r>
-      <w:r>
-        <w:rPr>
-          <w:b/>
-          <w:bCs/>
-        </w:rPr>
-        <w:t>Roll Numbers:</w:t>
-      </w:r>
-      <w:r>
-        <w:t xml:space="preserve"> </w:t>
-      </w:r>
-      <w:r>
-        <w:t>22I-0458, 22I-0510, 22I-0450</w:t>
-      </w:r>
-      <w:r>
-        <w:t xml:space="preserve"> </w:t>
-      </w:r>
+        <w:t>Submission: Final Project — Phase 1 (OCR Tool) + Phase 2 (Agentic Transformation)</w:t>
+      </w:r>
+      <w:r/>
+      <w:r>
+        <w:rPr>
+          <w:b/>
+          <w:bCs/>
+        </w:rPr>
+      </w:r>
+      <w:r/>
+      <w:r/>
+      <w:r>
+        <w:rPr>
+          <w:b/>
+          <w:bCs/>
+        </w:rPr>
+      </w:r>
+      <w:r/>
+      <w:r/>
+      <w:r/>
+      <w:r>
+        <w:rPr>
+          <w:b/>
+          <w:bCs/>
+        </w:rPr>
+      </w:r>
+      <w:r/>
+      <w:r/>
+      <w:r/>
     </w:p>
     <w:p>
       <w:r>
@@ -266,6 +252,102 @@
         <w:pict w14:anchorId="5A192798">
           <v:rect id="_x0000_i1135" style="width:0;height:1.5pt" o:hralign="center" o:hrstd="t" o:hr="t" fillcolor="#a0a0a0" stroked="f"/>
         </w:pict>
+      </w:r>
+    </w:p>
+    <w:p>
+      <w:r>
+        <w:rPr>
+          <w:b/>
+        </w:rPr>
+        <w:t>PART II — Phase 2: Agentic Transformation</w:t>
+      </w:r>
+    </w:p>
+    <w:p>
+      <w:r>
+        <w:t>14. Why We Transformed the System</w:t>
+      </w:r>
+    </w:p>
+    <w:p>
+      <w:r>
+        <w:t>15. Agentic Architecture</w:t>
+      </w:r>
+    </w:p>
+    <w:p>
+      <w:r>
+        <w:t>16. Operational Workflow — Observe, Decide, Act, Learn</w:t>
+      </w:r>
+    </w:p>
+    <w:p>
+      <w:r>
+        <w:t>17. Adaptive Decision-Making</w:t>
+      </w:r>
+    </w:p>
+    <w:p>
+      <w:r>
+        <w:t>18. Memory and Learning</w:t>
+      </w:r>
+    </w:p>
+    <w:p>
+      <w:r>
+        <w:t>19. Self-Evaluation and a Real Bug We Found</w:t>
+      </w:r>
+    </w:p>
+    <w:p>
+      <w:r>
+        <w:t>20. API Escalation as Last Resort</w:t>
+      </w:r>
+    </w:p>
+    <w:p>
+      <w:r>
+        <w:t>21. Phase 1 vs Phase 2 — Comparison</w:t>
+      </w:r>
+    </w:p>
+    <w:p>
+      <w:r>
+        <w:rPr>
+          <w:b/>
+        </w:rPr>
+        <w:t>PART III — Professional, Ethical, and Legal Practices</w:t>
+      </w:r>
+    </w:p>
+    <w:p>
+      <w:r>
+        <w:t>22. Computing as a Profession</w:t>
+      </w:r>
+    </w:p>
+    <w:p>
+      <w:r>
+        <w:t>23. Ethical Theories and the ACM/IEEE Code</w:t>
+      </w:r>
+    </w:p>
+    <w:p>
+      <w:r>
+        <w:t>24. Ethical Decision-Making in Our Project</w:t>
+      </w:r>
+    </w:p>
+    <w:p>
+      <w:r>
+        <w:t>25. Privacy, Data Protection, and PECA 2016</w:t>
+      </w:r>
+    </w:p>
+    <w:p>
+      <w:r>
+        <w:t>26. Intellectual Property and Licensing</w:t>
+      </w:r>
+    </w:p>
+    <w:p>
+      <w:r>
+        <w:t>27. Industry Practices, Trends, and Career Relevance</w:t>
+      </w:r>
+    </w:p>
+    <w:p>
+      <w:r>
+        <w:t>28. Risk Assessment and Safety Mechanisms</w:t>
+      </w:r>
+    </w:p>
+    <w:p>
+      <w:r>
+        <w:t>29. Conclusion</w:t>
       </w:r>
     </w:p>
     <w:p>
@@ -6843,135 +6925,2488 @@
         </w:pict>
       </w:r>
     </w:p>
-    <w:p>
-      <w:pPr>
-        <w:rPr>
-          <w:b/>
-          <w:bCs/>
-        </w:rPr>
-      </w:pPr>
-      <w:r>
-        <w:rPr>
-          <w:b/>
-          <w:bCs/>
-        </w:rPr>
-        <w:t>14. Conclusion and Future Work</w:t>
-      </w:r>
-    </w:p>
-    <w:p>
-      <w:pPr>
-        <w:rPr>
-          <w:b/>
-          <w:bCs/>
-        </w:rPr>
-      </w:pPr>
-      <w:r>
-        <w:rPr>
-          <w:b/>
-          <w:bCs/>
-        </w:rPr>
-        <w:t>14.1 Conclusion</w:t>
-      </w:r>
-    </w:p>
-    <w:p>
-      <w:r>
-        <w:t>We successfully built a working desktop application that converts images to formatted Word documents. The application:</w:t>
-      </w:r>
-    </w:p>
-    <w:p>
-      <w:pPr>
-        <w:numPr>
-          <w:ilvl w:val="0"/>
-          <w:numId w:val="10"/>
-        </w:numPr>
-      </w:pPr>
-      <w:r>
-        <w:t>Accepts JPG and PNG files through a clean GUI</w:t>
-      </w:r>
-    </w:p>
-    <w:p>
-      <w:pPr>
-        <w:numPr>
-          <w:ilvl w:val="0"/>
-          <w:numId w:val="10"/>
-        </w:numPr>
-      </w:pPr>
-      <w:r>
-        <w:t>Preprocesses images to improve OCR quality</w:t>
-      </w:r>
-    </w:p>
-    <w:p>
-      <w:pPr>
-        <w:numPr>
-          <w:ilvl w:val="0"/>
-          <w:numId w:val="10"/>
-        </w:numPr>
-      </w:pPr>
-      <w:r>
-        <w:t>Extracts text using EasyOCR with Tesseract as fallback</w:t>
-      </w:r>
-    </w:p>
-    <w:p>
-      <w:pPr>
-        <w:numPr>
-          <w:ilvl w:val="0"/>
-          <w:numId w:val="10"/>
-        </w:numPr>
-      </w:pPr>
-      <w:r>
-        <w:t>Detects headings, bullets, paragraphs, and two-column layouts</w:t>
-      </w:r>
-    </w:p>
-    <w:p>
-      <w:pPr>
-        <w:numPr>
-          <w:ilvl w:val="0"/>
-          <w:numId w:val="10"/>
-        </w:numPr>
-      </w:pPr>
-      <w:r>
-        <w:t>Generates properly formatted .docx files</w:t>
-      </w:r>
-    </w:p>
-    <w:p>
-      <w:pPr>
-        <w:numPr>
-          <w:ilvl w:val="0"/>
-          <w:numId w:val="10"/>
-        </w:numPr>
-      </w:pPr>
-      <w:r>
-        <w:lastRenderedPageBreak/>
-        <w:t>Completes in under 30 seconds per image</w:t>
-      </w:r>
-    </w:p>
-    <w:p>
-      <w:pPr>
-        <w:numPr>
-          <w:ilvl w:val="0"/>
-          <w:numId w:val="10"/>
-        </w:numPr>
-      </w:pPr>
-      <w:proofErr w:type="gramStart"/>
-      <w:r>
-        <w:t>Runs</w:t>
-      </w:r>
-      <w:proofErr w:type="gramEnd"/>
-      <w:r>
-        <w:t xml:space="preserve"> completely offline with no paid services</w:t>
-      </w:r>
-    </w:p>
-    <w:p>
-      <w:r>
-        <w:t>We demonstrated through systematic benchmarking why EasyOCR was chosen over four other engines, showing our decision was data-driven rather than arbitrary. We also discovered and corrected a critical preprocessing issue (over-aggressive binarization destroying JPEG images) that improved output quality.</w:t>
-      </w:r>
-    </w:p>
-    <w:p>
-      <w:r>
-        <w:t>The tool performs as specified for printed documents. The handwritten test images revealed real-world limitations of free OCR technology that we documented honestly rather than hiding.</w:t>
-      </w:r>
-    </w:p>
     <w:p/>
+    <w:p>
+      <w:r>
+        <w:rPr>
+          <w:b/>
+        </w:rPr>
+        <w:t>PART II — PHASE 2: AGENTIC TRANSFORMATION</w:t>
+      </w:r>
+    </w:p>
+    <w:p/>
+    <w:p>
+      <w:r>
+        <w:rPr>
+          <w:b/>
+        </w:rPr>
+        <w:t>14. Why We Transformed the System</w:t>
+      </w:r>
+    </w:p>
+    <w:p>
+      <w:r>
+        <w:t>The Phase 1 application worked but was a static tool. Every image went through the same fixed pipeline: open, preprocess, OCR, save. There was no adaptation, no awareness of input quality, no learning between runs, no warning if the output was clearly garbage, and no protection for the user if the image contained sensitive data.</w:t>
+      </w:r>
+    </w:p>
+    <w:p>
+      <w:r>
+        <w:t>Phase 2 of the project asked us to convert this static tool into a purely agentic system — software that perceives its environment, decides on a strategy, acts, evaluates the result, and learns from experience. We kept the entire Phase 1 code untouched and built the agentic layer on top of it. The original GUI is still accessible via python main.py --phase1, which lets us demonstrate both versions side by side.</w:t>
+      </w:r>
+    </w:p>
+    <w:p>
+      <w:r>
+        <w:rPr>
+          <w:b/>
+        </w:rPr>
+        <w:t>14.1 Limitations of Phase 1 We Wanted to Address</w:t>
+      </w:r>
+    </w:p>
+    <w:p>
+      <w:r>
+        <w:t>We listed the limitations honestly before starting:</w:t>
+      </w:r>
+    </w:p>
+    <w:p>
+      <w:r>
+        <w:t>1. Same preprocessing for every image. A bright high-resolution photo and a dark blurry phone capture both went through identical CLAHE and sharpening. We were over-processing some inputs and under-processing others.</w:t>
+      </w:r>
+    </w:p>
+    <w:p>
+      <w:r>
+        <w:t>2. The user had to pick the OCR engine manually. There was no way for the application to choose a better engine when the default failed.</w:t>
+      </w:r>
+    </w:p>
+    <w:p>
+      <w:r>
+        <w:t>3. Whatever OCR produced was accepted as the answer. If the engine returned a string of single characters, the application happily saved it to a Word file.</w:t>
+      </w:r>
+    </w:p>
+    <w:p>
+      <w:r>
+        <w:t>4. Nothing was logged. If the user asked why a particular result came out the way it did, we had no way to explain it after the fact.</w:t>
+      </w:r>
+    </w:p>
+    <w:p>
+      <w:r>
+        <w:t>5. There was no privacy check. Phone numbers, CNIC numbers, and emails in scanned notes would be extracted and saved without any warning.</w:t>
+      </w:r>
+    </w:p>
+    <w:p>
+      <w:r>
+        <w:t>6. Every run started from scratch. The application could not remember that the user usually corrected adsoaphon to adsorption.</w:t>
+      </w:r>
+    </w:p>
+    <w:p/>
+    <w:p>
+      <w:r>
+        <w:rPr>
+          <w:b/>
+        </w:rPr>
+        <w:t>15. Agentic Architecture</w:t>
+      </w:r>
+    </w:p>
+    <w:p>
+      <w:r>
+        <w:t>We designed the agentic layer as eight cooperating modules, each with one clear job. The Phase 1 modules sit underneath them, unchanged.</w:t>
+      </w:r>
+    </w:p>
+    <w:p>
+      <w:r>
+        <w:t>All agent modules live in src/agents/. The new entry point gui_agent.py wires them together with a redesigned interface.</w:t>
+      </w:r>
+    </w:p>
+    <w:p>
+      <w:r>
+        <w:rPr>
+          <w:b/>
+        </w:rPr>
+        <w:t>15.1 The Eight Agent Modules</w:t>
+      </w:r>
+    </w:p>
+    <w:tbl>
+      <w:tblPr>
+        <w:tblW w:type="auto" w:w="0"/>
+        <w:tblLook w:firstColumn="1" w:firstRow="1" w:lastColumn="0" w:lastRow="0" w:noHBand="0" w:noVBand="1" w:val="04A0"/>
+        <w:tblBorders>
+          <w:top w:val="single" w:sz="4" w:space="0" w:color="000000"/>
+          <w:left w:val="single" w:sz="4" w:space="0" w:color="000000"/>
+          <w:bottom w:val="single" w:sz="4" w:space="0" w:color="000000"/>
+          <w:right w:val="single" w:sz="4" w:space="0" w:color="000000"/>
+          <w:insideH w:val="single" w:sz="4" w:space="0" w:color="000000"/>
+          <w:insideV w:val="single" w:sz="4" w:space="0" w:color="000000"/>
+        </w:tblBorders>
+      </w:tblPr>
+      <w:tblGrid>
+        <w:gridCol w:w="3120"/>
+        <w:gridCol w:w="3120"/>
+        <w:gridCol w:w="3120"/>
+      </w:tblGrid>
+      <w:tr>
+        <w:tc>
+          <w:tcPr>
+            <w:tcW w:type="dxa" w:w="3120"/>
+          </w:tcPr>
+          <w:p>
+            <w:r/>
+            <w:r>
+              <w:rPr>
+                <w:b/>
+              </w:rPr>
+              <w:t>Module</w:t>
+            </w:r>
+          </w:p>
+        </w:tc>
+        <w:tc>
+          <w:tcPr>
+            <w:tcW w:type="dxa" w:w="3120"/>
+          </w:tcPr>
+          <w:p>
+            <w:r/>
+            <w:r>
+              <w:rPr>
+                <w:b/>
+              </w:rPr>
+              <w:t>Role</w:t>
+            </w:r>
+          </w:p>
+        </w:tc>
+        <w:tc>
+          <w:tcPr>
+            <w:tcW w:type="dxa" w:w="3120"/>
+          </w:tcPr>
+          <w:p>
+            <w:r/>
+            <w:r>
+              <w:rPr>
+                <w:b/>
+              </w:rPr>
+              <w:t>Phase 1 equivalent</w:t>
+            </w:r>
+          </w:p>
+        </w:tc>
+      </w:tr>
+      <w:tr>
+        <w:tc>
+          <w:tcPr>
+            <w:tcW w:type="dxa" w:w="3120"/>
+          </w:tcPr>
+          <w:p>
+            <w:r/>
+            <w:r>
+              <w:t>PerceptionAgent</w:t>
+            </w:r>
+          </w:p>
+        </w:tc>
+        <w:tc>
+          <w:tcPr>
+            <w:tcW w:type="dxa" w:w="3120"/>
+          </w:tcPr>
+          <w:p>
+            <w:r/>
+            <w:r>
+              <w:t>Analyses the image before OCR runs</w:t>
+            </w:r>
+          </w:p>
+        </w:tc>
+        <w:tc>
+          <w:tcPr>
+            <w:tcW w:type="dxa" w:w="3120"/>
+          </w:tcPr>
+          <w:p>
+            <w:r/>
+            <w:r>
+              <w:t>None</w:t>
+            </w:r>
+          </w:p>
+        </w:tc>
+      </w:tr>
+      <w:tr>
+        <w:tc>
+          <w:tcPr>
+            <w:tcW w:type="dxa" w:w="3120"/>
+          </w:tcPr>
+          <w:p>
+            <w:r/>
+            <w:r>
+              <w:t>DecisionEngine</w:t>
+            </w:r>
+          </w:p>
+        </w:tc>
+        <w:tc>
+          <w:tcPr>
+            <w:tcW w:type="dxa" w:w="3120"/>
+          </w:tcPr>
+          <w:p>
+            <w:r/>
+            <w:r>
+              <w:t>Picks engine and preprocessing strategy</w:t>
+            </w:r>
+          </w:p>
+        </w:tc>
+        <w:tc>
+          <w:tcPr>
+            <w:tcW w:type="dxa" w:w="3120"/>
+          </w:tcPr>
+          <w:p>
+            <w:r/>
+            <w:r>
+              <w:t>User dropdown</w:t>
+            </w:r>
+          </w:p>
+        </w:tc>
+      </w:tr>
+      <w:tr>
+        <w:tc>
+          <w:tcPr>
+            <w:tcW w:type="dxa" w:w="3120"/>
+          </w:tcPr>
+          <w:p>
+            <w:r/>
+            <w:r>
+              <w:t>MemoryStore</w:t>
+            </w:r>
+          </w:p>
+        </w:tc>
+        <w:tc>
+          <w:tcPr>
+            <w:tcW w:type="dxa" w:w="3120"/>
+          </w:tcPr>
+          <w:p>
+            <w:r/>
+            <w:r>
+              <w:t>Persists preferences, history, learned corrections</w:t>
+            </w:r>
+          </w:p>
+        </w:tc>
+        <w:tc>
+          <w:tcPr>
+            <w:tcW w:type="dxa" w:w="3120"/>
+          </w:tcPr>
+          <w:p>
+            <w:r/>
+            <w:r>
+              <w:t>None</w:t>
+            </w:r>
+          </w:p>
+        </w:tc>
+      </w:tr>
+      <w:tr>
+        <w:tc>
+          <w:tcPr>
+            <w:tcW w:type="dxa" w:w="3120"/>
+          </w:tcPr>
+          <w:p>
+            <w:r/>
+            <w:r>
+              <w:t>FeedbackLoop</w:t>
+            </w:r>
+          </w:p>
+        </w:tc>
+        <w:tc>
+          <w:tcPr>
+            <w:tcW w:type="dxa" w:w="3120"/>
+          </w:tcPr>
+          <w:p>
+            <w:r/>
+            <w:r>
+              <w:t>Scores OCR output, triggers retries, learns from edits</w:t>
+            </w:r>
+          </w:p>
+        </w:tc>
+        <w:tc>
+          <w:tcPr>
+            <w:tcW w:type="dxa" w:w="3120"/>
+          </w:tcPr>
+          <w:p>
+            <w:r/>
+            <w:r>
+              <w:t>None</w:t>
+            </w:r>
+          </w:p>
+        </w:tc>
+      </w:tr>
+      <w:tr>
+        <w:tc>
+          <w:tcPr>
+            <w:tcW w:type="dxa" w:w="3120"/>
+          </w:tcPr>
+          <w:p>
+            <w:r/>
+            <w:r>
+              <w:t>AgentLogger</w:t>
+            </w:r>
+          </w:p>
+        </w:tc>
+        <w:tc>
+          <w:tcPr>
+            <w:tcW w:type="dxa" w:w="3120"/>
+          </w:tcPr>
+          <w:p>
+            <w:r/>
+            <w:r>
+              <w:t>Records every decision with reasoning</w:t>
+            </w:r>
+          </w:p>
+        </w:tc>
+        <w:tc>
+          <w:tcPr>
+            <w:tcW w:type="dxa" w:w="3120"/>
+          </w:tcPr>
+          <w:p>
+            <w:r/>
+            <w:r>
+              <w:t>None</w:t>
+            </w:r>
+          </w:p>
+        </w:tc>
+      </w:tr>
+      <w:tr>
+        <w:tc>
+          <w:tcPr>
+            <w:tcW w:type="dxa" w:w="3120"/>
+          </w:tcPr>
+          <w:p>
+            <w:r/>
+            <w:r>
+              <w:t>SafetyGuard</w:t>
+            </w:r>
+          </w:p>
+        </w:tc>
+        <w:tc>
+          <w:tcPr>
+            <w:tcW w:type="dxa" w:w="3120"/>
+          </w:tcPr>
+          <w:p>
+            <w:r/>
+            <w:r>
+              <w:t>Classifies actions by risk, enforces autonomy level</w:t>
+            </w:r>
+          </w:p>
+        </w:tc>
+        <w:tc>
+          <w:tcPr>
+            <w:tcW w:type="dxa" w:w="3120"/>
+          </w:tcPr>
+          <w:p>
+            <w:r/>
+            <w:r>
+              <w:t>None</w:t>
+            </w:r>
+          </w:p>
+        </w:tc>
+      </w:tr>
+      <w:tr>
+        <w:tc>
+          <w:tcPr>
+            <w:tcW w:type="dxa" w:w="3120"/>
+          </w:tcPr>
+          <w:p>
+            <w:r/>
+            <w:r>
+              <w:t>PrivacyGuard</w:t>
+            </w:r>
+          </w:p>
+        </w:tc>
+        <w:tc>
+          <w:tcPr>
+            <w:tcW w:type="dxa" w:w="3120"/>
+          </w:tcPr>
+          <w:p>
+            <w:r/>
+            <w:r>
+              <w:t>Scans extracted text for PII</w:t>
+            </w:r>
+          </w:p>
+        </w:tc>
+        <w:tc>
+          <w:tcPr>
+            <w:tcW w:type="dxa" w:w="3120"/>
+          </w:tcPr>
+          <w:p>
+            <w:r/>
+            <w:r>
+              <w:t>None</w:t>
+            </w:r>
+          </w:p>
+        </w:tc>
+      </w:tr>
+      <w:tr>
+        <w:tc>
+          <w:tcPr>
+            <w:tcW w:type="dxa" w:w="3120"/>
+          </w:tcPr>
+          <w:p>
+            <w:r/>
+            <w:r>
+              <w:t>Orchestrator</w:t>
+            </w:r>
+          </w:p>
+        </w:tc>
+        <w:tc>
+          <w:tcPr>
+            <w:tcW w:type="dxa" w:w="3120"/>
+          </w:tcPr>
+          <w:p>
+            <w:r/>
+            <w:r>
+              <w:t>Runs the full Observe-Decide-Act-Learn cycle</w:t>
+            </w:r>
+          </w:p>
+        </w:tc>
+        <w:tc>
+          <w:tcPr>
+            <w:tcW w:type="dxa" w:w="3120"/>
+          </w:tcPr>
+          <w:p>
+            <w:r/>
+            <w:r>
+              <w:t>_ocr_task() in gui.py</w:t>
+            </w:r>
+          </w:p>
+        </w:tc>
+      </w:tr>
+    </w:tbl>
+    <w:p/>
+    <w:p>
+      <w:r>
+        <w:rPr>
+          <w:b/>
+        </w:rPr>
+        <w:t>15.2 Agent Type</w:t>
+      </w:r>
+    </w:p>
+    <w:p>
+      <w:r>
+        <w:t>Following the categories taught in class, our agent is a Goal-Based Agent with elements of a Learning Agent. The goal is to maximise OCR accuracy on whatever image the user opens. The Decision Engine evaluates strategies against this goal rather than just reacting to a stimulus. The MemoryStore and FeedbackLoop together give it the learning element — over time it accumulates per-engine performance data and a dictionary of corrections from previous user edits.</w:t>
+      </w:r>
+    </w:p>
+    <w:p/>
+    <w:p>
+      <w:r>
+        <w:rPr>
+          <w:b/>
+        </w:rPr>
+        <w:t>16. Operational Workflow — Observe, Decide, Act, Learn</w:t>
+      </w:r>
+    </w:p>
+    <w:p>
+      <w:r>
+        <w:t>The Orchestrator implements the full agentic cycle in process_image(). Below is the actual order of operations as it runs in the application:</w:t>
+      </w:r>
+    </w:p>
+    <w:p>
+      <w:r>
+        <w:t>Step 1 — Observe. PerceptionAgent reads the image with OpenCV and computes brightness, contrast, blur (Laplacian variance), skew angle, resolution, text density, and dominant colour. From these it builds an ImageProfile object and a composite quality score out of 100.</w:t>
+      </w:r>
+    </w:p>
+    <w:p>
+      <w:r>
+        <w:t>Step 2 — Decide. DecisionEngine takes the ImageProfile and selects an OCR engine and a preprocessing recipe. The rules are simple and explainable: dense text goes to Tesseract, blurry images go to EasyOCR, low resolution turns on upscaling, low contrast turns on CLAHE, and so on. If MemoryStore has historical performance data, the engine that previously scored highest gets preference.</w:t>
+      </w:r>
+    </w:p>
+    <w:p>
+      <w:r>
+        <w:t>Step 3 — Act. The Orchestrator runs the chosen pipeline. Preprocessing steps are applied conditionally based on the strategy — not the same fixed sequence as Phase 1. If red ink was detected, a dual-channel extraction is also performed and the two text streams are merged.</w:t>
+      </w:r>
+    </w:p>
+    <w:p>
+      <w:r>
+        <w:t>Step 4 — Evaluate. FeedbackLoop scores the output between 0 and 1. The score combines average OCR confidence, gibberish ratio, single-character token ratio, numeric token ratio, average token length, and total word count. If the score is below threshold, the Decision Engine is asked for a retry strategy with a different engine and stronger preprocessing.</w:t>
+      </w:r>
+    </w:p>
+    <w:p>
+      <w:r>
+        <w:t>Step 5 — Escalate. If the local engines have been retried and the score is still below 0.35, the agent escalates to an external Vision API as a final fallback. This step is described in detail in section 20.</w:t>
+      </w:r>
+    </w:p>
+    <w:p>
+      <w:r>
+        <w:t>Step 6 — Protect. PrivacyGuard scans the final text for emails, phone numbers, Pakistani CNICs, credit cards, and other PII patterns. Any detection is logged and surfaced in the Privacy tab.</w:t>
+      </w:r>
+    </w:p>
+    <w:p>
+      <w:r>
+        <w:t>Step 7 — Learn. The Orchestrator stores the conversion record (engine used, quality score, image stats) in MemoryStore. When the user later edits the OCR text and clicks Save, FeedbackLoop diffs the original and edited versions and stores the differences as correction patterns for future runs.</w:t>
+      </w:r>
+    </w:p>
+    <w:p/>
+    <w:p>
+      <w:r>
+        <w:rPr>
+          <w:b/>
+        </w:rPr>
+        <w:t>17. Adaptive Decision-Making</w:t>
+      </w:r>
+    </w:p>
+    <w:p>
+      <w:r>
+        <w:t>The Decision Engine replaced the manual engine dropdown from Phase 1. Instead of asking the user which OCR engine to run, the agent reads the ImageProfile and decides for itself.</w:t>
+      </w:r>
+    </w:p>
+    <w:p>
+      <w:r>
+        <w:rPr>
+          <w:b/>
+        </w:rPr>
+        <w:t>17.1 Selection Rules</w:t>
+      </w:r>
+    </w:p>
+    <w:p>
+      <w:r>
+        <w:t>We deliberately kept the rules transparent rather than using a black-box classifier. Every selection is logged with its reasoning so the user can audit the decision.</w:t>
+      </w:r>
+    </w:p>
+    <w:tbl>
+      <w:tblPr>
+        <w:tblW w:type="auto" w:w="0"/>
+        <w:tblLook w:firstColumn="1" w:firstRow="1" w:lastColumn="0" w:lastRow="0" w:noHBand="0" w:noVBand="1" w:val="04A0"/>
+        <w:tblBorders>
+          <w:top w:val="single" w:sz="4" w:space="0" w:color="000000"/>
+          <w:left w:val="single" w:sz="4" w:space="0" w:color="000000"/>
+          <w:bottom w:val="single" w:sz="4" w:space="0" w:color="000000"/>
+          <w:right w:val="single" w:sz="4" w:space="0" w:color="000000"/>
+          <w:insideH w:val="single" w:sz="4" w:space="0" w:color="000000"/>
+          <w:insideV w:val="single" w:sz="4" w:space="0" w:color="000000"/>
+        </w:tblBorders>
+      </w:tblPr>
+      <w:tblGrid>
+        <w:gridCol w:w="3120"/>
+        <w:gridCol w:w="3120"/>
+        <w:gridCol w:w="3120"/>
+      </w:tblGrid>
+      <w:tr>
+        <w:tc>
+          <w:tcPr>
+            <w:tcW w:type="dxa" w:w="3120"/>
+          </w:tcPr>
+          <w:p>
+            <w:r/>
+            <w:r>
+              <w:rPr>
+                <w:b/>
+              </w:rPr>
+              <w:t>Image characteristic</w:t>
+            </w:r>
+          </w:p>
+        </w:tc>
+        <w:tc>
+          <w:tcPr>
+            <w:tcW w:type="dxa" w:w="3120"/>
+          </w:tcPr>
+          <w:p>
+            <w:r/>
+            <w:r>
+              <w:rPr>
+                <w:b/>
+              </w:rPr>
+              <w:t>Engine selected</w:t>
+            </w:r>
+          </w:p>
+        </w:tc>
+        <w:tc>
+          <w:tcPr>
+            <w:tcW w:type="dxa" w:w="3120"/>
+          </w:tcPr>
+          <w:p>
+            <w:r/>
+            <w:r>
+              <w:rPr>
+                <w:b/>
+              </w:rPr>
+              <w:t>Why</w:t>
+            </w:r>
+          </w:p>
+        </w:tc>
+      </w:tr>
+      <w:tr>
+        <w:tc>
+          <w:tcPr>
+            <w:tcW w:type="dxa" w:w="3120"/>
+          </w:tcPr>
+          <w:p>
+            <w:r/>
+            <w:r>
+              <w:t>Dense text page</w:t>
+            </w:r>
+          </w:p>
+        </w:tc>
+        <w:tc>
+          <w:tcPr>
+            <w:tcW w:type="dxa" w:w="3120"/>
+          </w:tcPr>
+          <w:p>
+            <w:r/>
+            <w:r>
+              <w:t>Tesseract</w:t>
+            </w:r>
+          </w:p>
+        </w:tc>
+        <w:tc>
+          <w:tcPr>
+            <w:tcW w:type="dxa" w:w="3120"/>
+          </w:tcPr>
+          <w:p>
+            <w:r/>
+            <w:r>
+              <w:t>Better at packed printed lines</w:t>
+            </w:r>
+          </w:p>
+        </w:tc>
+      </w:tr>
+      <w:tr>
+        <w:tc>
+          <w:tcPr>
+            <w:tcW w:type="dxa" w:w="3120"/>
+          </w:tcPr>
+          <w:p>
+            <w:r/>
+            <w:r>
+              <w:t>Blurry image</w:t>
+            </w:r>
+          </w:p>
+        </w:tc>
+        <w:tc>
+          <w:tcPr>
+            <w:tcW w:type="dxa" w:w="3120"/>
+          </w:tcPr>
+          <w:p>
+            <w:r/>
+            <w:r>
+              <w:t>EasyOCR</w:t>
+            </w:r>
+          </w:p>
+        </w:tc>
+        <w:tc>
+          <w:tcPr>
+            <w:tcW w:type="dxa" w:w="3120"/>
+          </w:tcPr>
+          <w:p>
+            <w:r/>
+            <w:r>
+              <w:t>More tolerant of soft edges</w:t>
+            </w:r>
+          </w:p>
+        </w:tc>
+      </w:tr>
+      <w:tr>
+        <w:tc>
+          <w:tcPr>
+            <w:tcW w:type="dxa" w:w="3120"/>
+          </w:tcPr>
+          <w:p>
+            <w:r/>
+            <w:r>
+              <w:t>Dark or low contrast</w:t>
+            </w:r>
+          </w:p>
+        </w:tc>
+        <w:tc>
+          <w:tcPr>
+            <w:tcW w:type="dxa" w:w="3120"/>
+          </w:tcPr>
+          <w:p>
+            <w:r/>
+            <w:r>
+              <w:t>EasyOCR + enhanced preprocessing</w:t>
+            </w:r>
+          </w:p>
+        </w:tc>
+        <w:tc>
+          <w:tcPr>
+            <w:tcW w:type="dxa" w:w="3120"/>
+          </w:tcPr>
+          <w:p>
+            <w:r/>
+            <w:r>
+              <w:t>CLAHE plus EasyOCR's robustness</w:t>
+            </w:r>
+          </w:p>
+        </w:tc>
+      </w:tr>
+      <w:tr>
+        <w:tc>
+          <w:tcPr>
+            <w:tcW w:type="dxa" w:w="3120"/>
+          </w:tcPr>
+          <w:p>
+            <w:r/>
+            <w:r>
+              <w:t>Good quality + history available</w:t>
+            </w:r>
+          </w:p>
+        </w:tc>
+        <w:tc>
+          <w:tcPr>
+            <w:tcW w:type="dxa" w:w="3120"/>
+          </w:tcPr>
+          <w:p>
+            <w:r/>
+            <w:r>
+              <w:t>Best historical engine</w:t>
+            </w:r>
+          </w:p>
+        </w:tc>
+        <w:tc>
+          <w:tcPr>
+            <w:tcW w:type="dxa" w:w="3120"/>
+          </w:tcPr>
+          <w:p>
+            <w:r/>
+            <w:r>
+              <w:t>Memory drives the choice</w:t>
+            </w:r>
+          </w:p>
+        </w:tc>
+      </w:tr>
+      <w:tr>
+        <w:tc>
+          <w:tcPr>
+            <w:tcW w:type="dxa" w:w="3120"/>
+          </w:tcPr>
+          <w:p>
+            <w:r/>
+            <w:r>
+              <w:t>Standard handwriting</w:t>
+            </w:r>
+          </w:p>
+        </w:tc>
+        <w:tc>
+          <w:tcPr>
+            <w:tcW w:type="dxa" w:w="3120"/>
+          </w:tcPr>
+          <w:p>
+            <w:r/>
+            <w:r>
+              <w:t>EasyOCR</w:t>
+            </w:r>
+          </w:p>
+        </w:tc>
+        <w:tc>
+          <w:tcPr>
+            <w:tcW w:type="dxa" w:w="3120"/>
+          </w:tcPr>
+          <w:p>
+            <w:r/>
+            <w:r>
+              <w:t>Default for handwriting</w:t>
+            </w:r>
+          </w:p>
+        </w:tc>
+      </w:tr>
+    </w:tbl>
+    <w:p/>
+    <w:p>
+      <w:r>
+        <w:rPr>
+          <w:b/>
+        </w:rPr>
+        <w:t>17.2 Adaptive Preprocessing</w:t>
+      </w:r>
+    </w:p>
+    <w:p>
+      <w:r>
+        <w:t>Preprocessing is no longer a fixed pipeline. The strategy object carries five independent flags — apply_upscale, apply_brightness_enhance, apply_contrast_enhance, apply_sharpening, apply_deskew — and the orchestrator only runs the steps the strategy enabled. A bright high-resolution image gets minimal processing; a dark low-resolution image gets the full set.</w:t>
+      </w:r>
+    </w:p>
+    <w:p/>
+    <w:p>
+      <w:r>
+        <w:rPr>
+          <w:b/>
+        </w:rPr>
+        <w:t>18. Memory and Learning</w:t>
+      </w:r>
+    </w:p>
+    <w:p>
+      <w:r>
+        <w:t>MemoryStore writes a single JSON file at data/agent_memory.json and a JSONL audit log at data/agent_decisions.jsonl. Both are created the first time the application runs.</w:t>
+      </w:r>
+    </w:p>
+    <w:p>
+      <w:r>
+        <w:rPr>
+          <w:b/>
+        </w:rPr>
+        <w:t>18.1 What the Agent Remembers</w:t>
+      </w:r>
+    </w:p>
+    <w:p>
+      <w:r>
+        <w:t>Long-term storage holds four kinds of information. User preferences such as a preferred engine or auto-enhance setting. The history of the last 200 conversions including which engine was used and the resulting quality score. Per-engine statistics — total runs and average confidence per engine. And a dictionary of correction patterns learned from user edits.</w:t>
+      </w:r>
+    </w:p>
+    <w:p>
+      <w:r>
+        <w:rPr>
+          <w:b/>
+        </w:rPr>
+        <w:t>18.2 The Learning Cycle</w:t>
+      </w:r>
+    </w:p>
+    <w:p>
+      <w:r>
+        <w:t>Learning happens through the Save action. When the user clicks Save, FeedbackLoop compares the OCR text it produced with whatever the user actually typed in the editable text panel. The differences are extracted using SequenceMatcher and stored as wrong → correct pairs. On future runs, these pairs are applied automatically to new OCR output before the document is saved. Over many runs the agent accumulates a personal correction dictionary specific to the user's documents.</w:t>
+      </w:r>
+    </w:p>
+    <w:p>
+      <w:r>
+        <w:rPr>
+          <w:b/>
+        </w:rPr>
+        <w:t>18.3 Short-Term vs Long-Term</w:t>
+      </w:r>
+    </w:p>
+    <w:p>
+      <w:r>
+        <w:t>Short-term memory is the current session — the live decision log shown in the Agent Log tab. It is cleared when the application closes. Long-term memory is the JSON file on disk, which survives across sessions. The user can wipe it at any time from the Agent menu using Clear Memory.</w:t>
+      </w:r>
+    </w:p>
+    <w:p/>
+    <w:p>
+      <w:r>
+        <w:rPr>
+          <w:b/>
+        </w:rPr>
+        <w:t>19. Self-Evaluation and a Real Bug We Found</w:t>
+      </w:r>
+    </w:p>
+    <w:p>
+      <w:r>
+        <w:t>The Feedback Loop was supposed to detect bad OCR output and trigger a retry. While testing on a clean handwritten note we hit a situation that exposed a deeper problem and taught us a lesson worth writing down.</w:t>
+      </w:r>
+    </w:p>
+    <w:p>
+      <w:r>
+        <w:rPr>
+          <w:b/>
+        </w:rPr>
+        <w:t>19.1 The Symptom</w:t>
+      </w:r>
+    </w:p>
+    <w:p>
+      <w:r>
+        <w:t>We opened a clear photograph of the words "One page handwriting" followed by four neat lines of cursive. EasyOCR is generally reliable on input like this. Instead, the FeedbackLoop reported a score of 0.00 and the agent escalated to the Vision API. We were suspicious — the local engines should have handled this image.</w:t>
+      </w:r>
+    </w:p>
+    <w:p>
+      <w:r>
+        <w:rPr>
+          <w:b/>
+        </w:rPr>
+        <w:t>19.2 The Investigation</w:t>
+      </w:r>
+    </w:p>
+    <w:p>
+      <w:r>
+        <w:t>Looking at the agent log we noticed a single line that did not look right: "Skewed by 90.0° → deskew enabled". A 90 degree skew on a photograph that was clearly horizontal could not be a real measurement. The deskew operation was therefore rotating the image by 90 degrees before EasyOCR ever saw it. EasyOCR was being asked to read vertical text, and it was producing the only thing it reasonably could — fragmented single characters.</w:t>
+      </w:r>
+    </w:p>
+    <w:p>
+      <w:r>
+        <w:rPr>
+          <w:b/>
+        </w:rPr>
+        <w:t>19.3 The Cause</w:t>
+      </w:r>
+    </w:p>
+    <w:p>
+      <w:r>
+        <w:t>The skew estimator used cv2.minAreaRect on the binarised image. OpenCV changed the angle convention of this function in version 4.5. In the old convention, the angle for a horizontal rectangle was 0. In the new convention, the angle for a horizontal rectangle is 90. Our code was written against the old convention, so any image with horizontal text now reported a 90 degree skew and got rotated. We confirmed this in two lines:</w:t>
+      </w:r>
+    </w:p>
+    <w:p>
+      <w:r>
+        <w:t xml:space="preserve">    rect = cv2.minAreaRect(coords)   # for a horizontal bar</w:t>
+      </w:r>
+    </w:p>
+    <w:p>
+      <w:r>
+        <w:t xml:space="preserve">    print(rect[-1])                  # prints 90.0 in OpenCV 4.10</w:t>
+      </w:r>
+    </w:p>
+    <w:p>
+      <w:r>
+        <w:rPr>
+          <w:b/>
+        </w:rPr>
+        <w:t>19.4 The Fix</w:t>
+      </w:r>
+    </w:p>
+    <w:p>
+      <w:r>
+        <w:t>We made two small changes. First, the angle is normalised so that 0 always means horizontal regardless of OpenCV version. Second, we added a sanity clamp — any detected skew greater than 15 degrees is rejected as a misdetection because real document skew on a phone photo is rarely that extreme. After the fix, the same image now reports skew = 0.0, the deskew step is skipped, EasyOCR reads the text correctly, the FeedbackLoop scores it well, and the API escalation never triggers.</w:t>
+      </w:r>
+    </w:p>
+    <w:p>
+      <w:r>
+        <w:rPr>
+          <w:b/>
+        </w:rPr>
+        <w:t>19.5 What We Learned</w:t>
+      </w:r>
+    </w:p>
+    <w:p>
+      <w:r>
+        <w:t>Two things. First, having a self-evaluating feedback loop was directly useful — without the consistent 0.00 score, we would not have noticed the deskew was misbehaving. Second, the agent log made the diagnosis quick. The single line "Skewed by 90.0°" pointed straight at the cause. A static tool with no logging would have left us guessing why EasyOCR was suddenly bad at handwriting.</w:t>
+      </w:r>
+    </w:p>
+    <w:p>
+      <w:r>
+        <w:rPr>
+          <w:b/>
+        </w:rPr>
+        <w:t>19.6 The Quality Score in Detail</w:t>
+      </w:r>
+    </w:p>
+    <w:p>
+      <w:r>
+        <w:t>The score is computed in feedback_loop.py. We start with the average OCR confidence and subtract penalties for problems we specifically watch for:</w:t>
+      </w:r>
+    </w:p>
+    <w:tbl>
+      <w:tblPr>
+        <w:tblW w:type="auto" w:w="0"/>
+        <w:tblLook w:firstColumn="1" w:firstRow="1" w:lastColumn="0" w:lastRow="0" w:noHBand="0" w:noVBand="1" w:val="04A0"/>
+        <w:tblBorders>
+          <w:top w:val="single" w:sz="4" w:space="0" w:color="000000"/>
+          <w:left w:val="single" w:sz="4" w:space="0" w:color="000000"/>
+          <w:bottom w:val="single" w:sz="4" w:space="0" w:color="000000"/>
+          <w:right w:val="single" w:sz="4" w:space="0" w:color="000000"/>
+          <w:insideH w:val="single" w:sz="4" w:space="0" w:color="000000"/>
+          <w:insideV w:val="single" w:sz="4" w:space="0" w:color="000000"/>
+        </w:tblBorders>
+      </w:tblPr>
+      <w:tblGrid>
+        <w:gridCol w:w="4680"/>
+        <w:gridCol w:w="4680"/>
+      </w:tblGrid>
+      <w:tr>
+        <w:tc>
+          <w:tcPr>
+            <w:tcW w:type="dxa" w:w="4680"/>
+          </w:tcPr>
+          <w:p>
+            <w:r/>
+            <w:r>
+              <w:rPr>
+                <w:b/>
+              </w:rPr>
+              <w:t>Penalty</w:t>
+            </w:r>
+          </w:p>
+        </w:tc>
+        <w:tc>
+          <w:tcPr>
+            <w:tcW w:type="dxa" w:w="4680"/>
+          </w:tcPr>
+          <w:p>
+            <w:r/>
+            <w:r>
+              <w:rPr>
+                <w:b/>
+              </w:rPr>
+              <w:t>Trigger</w:t>
+            </w:r>
+          </w:p>
+        </w:tc>
+      </w:tr>
+      <w:tr>
+        <w:tc>
+          <w:tcPr>
+            <w:tcW w:type="dxa" w:w="4680"/>
+          </w:tcPr>
+          <w:p>
+            <w:r/>
+            <w:r>
+              <w:t>Gibberish ratio</w:t>
+            </w:r>
+          </w:p>
+        </w:tc>
+        <w:tc>
+          <w:tcPr>
+            <w:tcW w:type="dxa" w:w="4680"/>
+          </w:tcPr>
+          <w:p>
+            <w:r/>
+            <w:r>
+              <w:t>Words with consonant clusters or no vowels</w:t>
+            </w:r>
+          </w:p>
+        </w:tc>
+      </w:tr>
+      <w:tr>
+        <w:tc>
+          <w:tcPr>
+            <w:tcW w:type="dxa" w:w="4680"/>
+          </w:tcPr>
+          <w:p>
+            <w:r/>
+            <w:r>
+              <w:t>Short-word ratio</w:t>
+            </w:r>
+          </w:p>
+        </w:tc>
+        <w:tc>
+          <w:tcPr>
+            <w:tcW w:type="dxa" w:w="4680"/>
+          </w:tcPr>
+          <w:p>
+            <w:r/>
+            <w:r>
+              <w:t>Tokens of length 1-2 above 30% of total</w:t>
+            </w:r>
+          </w:p>
+        </w:tc>
+      </w:tr>
+      <w:tr>
+        <w:tc>
+          <w:tcPr>
+            <w:tcW w:type="dxa" w:w="4680"/>
+          </w:tcPr>
+          <w:p>
+            <w:r/>
+            <w:r>
+              <w:t>Fragmentation</w:t>
+            </w:r>
+          </w:p>
+        </w:tc>
+        <w:tc>
+          <w:tcPr>
+            <w:tcW w:type="dxa" w:w="4680"/>
+          </w:tcPr>
+          <w:p>
+            <w:r/>
+            <w:r>
+              <w:t>Single-character tokens — strongest failure signal</w:t>
+            </w:r>
+          </w:p>
+        </w:tc>
+      </w:tr>
+      <w:tr>
+        <w:tc>
+          <w:tcPr>
+            <w:tcW w:type="dxa" w:w="4680"/>
+          </w:tcPr>
+          <w:p>
+            <w:r/>
+            <w:r>
+              <w:t>Numeric dominance</w:t>
+            </w:r>
+          </w:p>
+        </w:tc>
+        <w:tc>
+          <w:tcPr>
+            <w:tcW w:type="dxa" w:w="4680"/>
+          </w:tcPr>
+          <w:p>
+            <w:r/>
+            <w:r>
+              <w:t>Many isolated digits, suggests diagram confusion</w:t>
+            </w:r>
+          </w:p>
+        </w:tc>
+      </w:tr>
+      <w:tr>
+        <w:tc>
+          <w:tcPr>
+            <w:tcW w:type="dxa" w:w="4680"/>
+          </w:tcPr>
+          <w:p>
+            <w:r/>
+            <w:r>
+              <w:t>Average token length</w:t>
+            </w:r>
+          </w:p>
+        </w:tc>
+        <w:tc>
+          <w:tcPr>
+            <w:tcW w:type="dxa" w:w="4680"/>
+          </w:tcPr>
+          <w:p>
+            <w:r/>
+            <w:r>
+              <w:t>Penalty grows as average length drops below 3</w:t>
+            </w:r>
+          </w:p>
+        </w:tc>
+      </w:tr>
+    </w:tbl>
+    <w:p/>
+    <w:p>
+      <w:r>
+        <w:t>We added the fragmentation and numeric-dominance penalties after the skew bug was found. The original scorer was passing the rotated-image output at 0.60 because individually "L", "8" and "H" are not gibberish. The new scorer correctly rates that output 0.00.</w:t>
+      </w:r>
+    </w:p>
+    <w:p/>
+    <w:p>
+      <w:r>
+        <w:rPr>
+          <w:b/>
+        </w:rPr>
+        <w:t>20. API Escalation as Last Resort</w:t>
+      </w:r>
+    </w:p>
+    <w:p>
+      <w:r>
+        <w:t>Some images are genuinely hard. Messy handwritten chemistry notes with hand-drawn diagrams, equations, and mixed colours defeat all the local engines we tested. We needed a path for these cases that did not turn the agent into a thin wrapper around an external API.</w:t>
+      </w:r>
+    </w:p>
+    <w:p>
+      <w:r>
+        <w:rPr>
+          <w:b/>
+        </w:rPr>
+        <w:t>20.1 The Decision the Agent Makes</w:t>
+      </w:r>
+    </w:p>
+    <w:p>
+      <w:r>
+        <w:t>When the local engines have been retried and the FeedbackLoop score is still below 0.35, the agent decides whether to send the image to OpenAI's gpt-4o-mini Vision API. The decision is conditional on three things — the user's autonomy setting (manual mode blocks the API entirely), the presence of an OPENAI_API_KEY in the .env file, and a privacy notice that is logged before the request is sent.</w:t>
+      </w:r>
+    </w:p>
+    <w:p>
+      <w:r>
+        <w:rPr>
+          <w:b/>
+        </w:rPr>
+        <w:t>20.2 Why This Order Matters</w:t>
+      </w:r>
+    </w:p>
+    <w:p>
+      <w:r>
+        <w:t>We deliberately put the API at the end of the pipeline rather than at the start. A cloud API would always score better than local OCR on hard handwriting, and if we let the agent reach for it first the local engines would never be used and the project would lose the point. Local first, API only when local clearly failed, is a real cost-and-privacy decision the agent makes — exactly the kind of trade-off we want it to demonstrate.</w:t>
+      </w:r>
+    </w:p>
+    <w:p>
+      <w:r>
+        <w:rPr>
+          <w:b/>
+        </w:rPr>
+        <w:t>20.3 Adoption Logic</w:t>
+      </w:r>
+    </w:p>
+    <w:p>
+      <w:r>
+        <w:t>Once the API result returns, FeedbackLoop scores it the same way as any other OCR output. The agent then compares the API score to the best local score and adopts whichever is higher. This means an API result of 0.49 can be ACCEPTED even though it does not pass the 0.50 acceptability threshold — best available wins. The two checks ("acceptable in absolute terms" and "better than what we had") are deliberately separate.</w:t>
+      </w:r>
+    </w:p>
+    <w:p>
+      <w:r>
+        <w:rPr>
+          <w:b/>
+        </w:rPr>
+        <w:t>20.4 Honest Limitation</w:t>
+      </w:r>
+    </w:p>
+    <w:p>
+      <w:r>
+        <w:t>The PrivacyGuard's notice before the API call is currently a log entry, not a blocker. The PII scanner runs on extracted text, not on the image itself, so we cannot stop sensitive content from reaching the API based on image content alone. A user concerned about an image must either set autonomy to manual (blocks all API calls) or remove the OPENAI_API_KEY from .env. We documented this limitation rather than papering over it.</w:t>
+      </w:r>
+    </w:p>
+    <w:p/>
+    <w:p>
+      <w:r>
+        <w:rPr>
+          <w:b/>
+        </w:rPr>
+        <w:t>21. Phase 1 vs Phase 2 — Comparison</w:t>
+      </w:r>
+    </w:p>
+    <w:tbl>
+      <w:tblPr>
+        <w:tblW w:type="auto" w:w="0"/>
+        <w:tblLook w:firstColumn="1" w:firstRow="1" w:lastColumn="0" w:lastRow="0" w:noHBand="0" w:noVBand="1" w:val="04A0"/>
+        <w:tblBorders>
+          <w:top w:val="single" w:sz="4" w:space="0" w:color="000000"/>
+          <w:left w:val="single" w:sz="4" w:space="0" w:color="000000"/>
+          <w:bottom w:val="single" w:sz="4" w:space="0" w:color="000000"/>
+          <w:right w:val="single" w:sz="4" w:space="0" w:color="000000"/>
+          <w:insideH w:val="single" w:sz="4" w:space="0" w:color="000000"/>
+          <w:insideV w:val="single" w:sz="4" w:space="0" w:color="000000"/>
+        </w:tblBorders>
+      </w:tblPr>
+      <w:tblGrid>
+        <w:gridCol w:w="3120"/>
+        <w:gridCol w:w="3120"/>
+        <w:gridCol w:w="3120"/>
+      </w:tblGrid>
+      <w:tr>
+        <w:tc>
+          <w:tcPr>
+            <w:tcW w:type="dxa" w:w="3120"/>
+          </w:tcPr>
+          <w:p>
+            <w:r/>
+            <w:r>
+              <w:rPr>
+                <w:b/>
+              </w:rPr>
+              <w:t>Feature</w:t>
+            </w:r>
+          </w:p>
+        </w:tc>
+        <w:tc>
+          <w:tcPr>
+            <w:tcW w:type="dxa" w:w="3120"/>
+          </w:tcPr>
+          <w:p>
+            <w:r/>
+            <w:r>
+              <w:rPr>
+                <w:b/>
+              </w:rPr>
+              <w:t>Phase 1 (static tool)</w:t>
+            </w:r>
+          </w:p>
+        </w:tc>
+        <w:tc>
+          <w:tcPr>
+            <w:tcW w:type="dxa" w:w="3120"/>
+          </w:tcPr>
+          <w:p>
+            <w:r/>
+            <w:r>
+              <w:rPr>
+                <w:b/>
+              </w:rPr>
+              <w:t>Phase 2 (agentic system)</w:t>
+            </w:r>
+          </w:p>
+        </w:tc>
+      </w:tr>
+      <w:tr>
+        <w:tc>
+          <w:tcPr>
+            <w:tcW w:type="dxa" w:w="3120"/>
+          </w:tcPr>
+          <w:p>
+            <w:r/>
+            <w:r>
+              <w:t>Control</w:t>
+            </w:r>
+          </w:p>
+        </w:tc>
+        <w:tc>
+          <w:tcPr>
+            <w:tcW w:type="dxa" w:w="3120"/>
+          </w:tcPr>
+          <w:p>
+            <w:r/>
+            <w:r>
+              <w:t>User-driven, every step manual</w:t>
+            </w:r>
+          </w:p>
+        </w:tc>
+        <w:tc>
+          <w:tcPr>
+            <w:tcW w:type="dxa" w:w="3120"/>
+          </w:tcPr>
+          <w:p>
+            <w:r/>
+            <w:r>
+              <w:t>System-driven within user-set autonomy</w:t>
+            </w:r>
+          </w:p>
+        </w:tc>
+      </w:tr>
+      <w:tr>
+        <w:tc>
+          <w:tcPr>
+            <w:tcW w:type="dxa" w:w="3120"/>
+          </w:tcPr>
+          <w:p>
+            <w:r/>
+            <w:r>
+              <w:t>Intelligence</w:t>
+            </w:r>
+          </w:p>
+        </w:tc>
+        <w:tc>
+          <w:tcPr>
+            <w:tcW w:type="dxa" w:w="3120"/>
+          </w:tcPr>
+          <w:p>
+            <w:r/>
+            <w:r>
+              <w:t>Static, identical pipeline every time</w:t>
+            </w:r>
+          </w:p>
+        </w:tc>
+        <w:tc>
+          <w:tcPr>
+            <w:tcW w:type="dxa" w:w="3120"/>
+          </w:tcPr>
+          <w:p>
+            <w:r/>
+            <w:r>
+              <w:t>Adaptive, pipeline changes per image</w:t>
+            </w:r>
+          </w:p>
+        </w:tc>
+      </w:tr>
+      <w:tr>
+        <w:tc>
+          <w:tcPr>
+            <w:tcW w:type="dxa" w:w="3120"/>
+          </w:tcPr>
+          <w:p>
+            <w:r/>
+            <w:r>
+              <w:t>Behaviour</w:t>
+            </w:r>
+          </w:p>
+        </w:tc>
+        <w:tc>
+          <w:tcPr>
+            <w:tcW w:type="dxa" w:w="3120"/>
+          </w:tcPr>
+          <w:p>
+            <w:r/>
+            <w:r>
+              <w:t>Reactive, waits for the user</w:t>
+            </w:r>
+          </w:p>
+        </w:tc>
+        <w:tc>
+          <w:tcPr>
+            <w:tcW w:type="dxa" w:w="3120"/>
+          </w:tcPr>
+          <w:p>
+            <w:r/>
+            <w:r>
+              <w:t>Proactive, suggests strategy and retries</w:t>
+            </w:r>
+          </w:p>
+        </w:tc>
+      </w:tr>
+      <w:tr>
+        <w:tc>
+          <w:tcPr>
+            <w:tcW w:type="dxa" w:w="3120"/>
+          </w:tcPr>
+          <w:p>
+            <w:r/>
+            <w:r>
+              <w:t>OCR engine</w:t>
+            </w:r>
+          </w:p>
+        </w:tc>
+        <w:tc>
+          <w:tcPr>
+            <w:tcW w:type="dxa" w:w="3120"/>
+          </w:tcPr>
+          <w:p>
+            <w:r/>
+            <w:r>
+              <w:t>Hardcoded or user-picked</w:t>
+            </w:r>
+          </w:p>
+        </w:tc>
+        <w:tc>
+          <w:tcPr>
+            <w:tcW w:type="dxa" w:w="3120"/>
+          </w:tcPr>
+          <w:p>
+            <w:r/>
+            <w:r>
+              <w:t>Auto-selected from image analysis and history</w:t>
+            </w:r>
+          </w:p>
+        </w:tc>
+      </w:tr>
+      <w:tr>
+        <w:tc>
+          <w:tcPr>
+            <w:tcW w:type="dxa" w:w="3120"/>
+          </w:tcPr>
+          <w:p>
+            <w:r/>
+            <w:r>
+              <w:t>Preprocessing</w:t>
+            </w:r>
+          </w:p>
+        </w:tc>
+        <w:tc>
+          <w:tcPr>
+            <w:tcW w:type="dxa" w:w="3120"/>
+          </w:tcPr>
+          <w:p>
+            <w:r/>
+            <w:r>
+              <w:t>One fixed sequence</w:t>
+            </w:r>
+          </w:p>
+        </w:tc>
+        <w:tc>
+          <w:tcPr>
+            <w:tcW w:type="dxa" w:w="3120"/>
+          </w:tcPr>
+          <w:p>
+            <w:r/>
+            <w:r>
+              <w:t>Conditional steps per image</w:t>
+            </w:r>
+          </w:p>
+        </w:tc>
+      </w:tr>
+      <w:tr>
+        <w:tc>
+          <w:tcPr>
+            <w:tcW w:type="dxa" w:w="3120"/>
+          </w:tcPr>
+          <w:p>
+            <w:r/>
+            <w:r>
+              <w:t>Output check</w:t>
+            </w:r>
+          </w:p>
+        </w:tc>
+        <w:tc>
+          <w:tcPr>
+            <w:tcW w:type="dxa" w:w="3120"/>
+          </w:tcPr>
+          <w:p>
+            <w:r/>
+            <w:r>
+              <w:t>None — output is accepted</w:t>
+            </w:r>
+          </w:p>
+        </w:tc>
+        <w:tc>
+          <w:tcPr>
+            <w:tcW w:type="dxa" w:w="3120"/>
+          </w:tcPr>
+          <w:p>
+            <w:r/>
+            <w:r>
+              <w:t>Quality score, retries, escalation</w:t>
+            </w:r>
+          </w:p>
+        </w:tc>
+      </w:tr>
+      <w:tr>
+        <w:tc>
+          <w:tcPr>
+            <w:tcW w:type="dxa" w:w="3120"/>
+          </w:tcPr>
+          <w:p>
+            <w:r/>
+            <w:r>
+              <w:t>Memory</w:t>
+            </w:r>
+          </w:p>
+        </w:tc>
+        <w:tc>
+          <w:tcPr>
+            <w:tcW w:type="dxa" w:w="3120"/>
+          </w:tcPr>
+          <w:p>
+            <w:r/>
+            <w:r>
+              <w:t>None — fresh every run</w:t>
+            </w:r>
+          </w:p>
+        </w:tc>
+        <w:tc>
+          <w:tcPr>
+            <w:tcW w:type="dxa" w:w="3120"/>
+          </w:tcPr>
+          <w:p>
+            <w:r/>
+            <w:r>
+              <w:t>Preferences, history, learned corrections</w:t>
+            </w:r>
+          </w:p>
+        </w:tc>
+      </w:tr>
+      <w:tr>
+        <w:tc>
+          <w:tcPr>
+            <w:tcW w:type="dxa" w:w="3120"/>
+          </w:tcPr>
+          <w:p>
+            <w:r/>
+            <w:r>
+              <w:t>Privacy</w:t>
+            </w:r>
+          </w:p>
+        </w:tc>
+        <w:tc>
+          <w:tcPr>
+            <w:tcW w:type="dxa" w:w="3120"/>
+          </w:tcPr>
+          <w:p>
+            <w:r/>
+            <w:r>
+              <w:t>None</w:t>
+            </w:r>
+          </w:p>
+        </w:tc>
+        <w:tc>
+          <w:tcPr>
+            <w:tcW w:type="dxa" w:w="3120"/>
+          </w:tcPr>
+          <w:p>
+            <w:r/>
+            <w:r>
+              <w:t>PII scan, autonomy modes</w:t>
+            </w:r>
+          </w:p>
+        </w:tc>
+      </w:tr>
+      <w:tr>
+        <w:tc>
+          <w:tcPr>
+            <w:tcW w:type="dxa" w:w="3120"/>
+          </w:tcPr>
+          <w:p>
+            <w:r/>
+            <w:r>
+              <w:t>Logging</w:t>
+            </w:r>
+          </w:p>
+        </w:tc>
+        <w:tc>
+          <w:tcPr>
+            <w:tcW w:type="dxa" w:w="3120"/>
+          </w:tcPr>
+          <w:p>
+            <w:r/>
+            <w:r>
+              <w:t>None</w:t>
+            </w:r>
+          </w:p>
+        </w:tc>
+        <w:tc>
+          <w:tcPr>
+            <w:tcW w:type="dxa" w:w="3120"/>
+          </w:tcPr>
+          <w:p>
+            <w:r/>
+            <w:r>
+              <w:t>Every decision with reasoning</w:t>
+            </w:r>
+          </w:p>
+        </w:tc>
+      </w:tr>
+      <w:tr>
+        <w:tc>
+          <w:tcPr>
+            <w:tcW w:type="dxa" w:w="3120"/>
+          </w:tcPr>
+          <w:p>
+            <w:r/>
+            <w:r>
+              <w:t>Recovery</w:t>
+            </w:r>
+          </w:p>
+        </w:tc>
+        <w:tc>
+          <w:tcPr>
+            <w:tcW w:type="dxa" w:w="3120"/>
+          </w:tcPr>
+          <w:p>
+            <w:r/>
+            <w:r>
+              <w:t>Crashes or shows error</w:t>
+            </w:r>
+          </w:p>
+        </w:tc>
+        <w:tc>
+          <w:tcPr>
+            <w:tcW w:type="dxa" w:w="3120"/>
+          </w:tcPr>
+          <w:p>
+            <w:r/>
+            <w:r>
+              <w:t>Retry with new strategy, then API fallback</w:t>
+            </w:r>
+          </w:p>
+        </w:tc>
+      </w:tr>
+      <w:tr>
+        <w:tc>
+          <w:tcPr>
+            <w:tcW w:type="dxa" w:w="3120"/>
+          </w:tcPr>
+          <w:p>
+            <w:r/>
+            <w:r>
+              <w:t>User feedback</w:t>
+            </w:r>
+          </w:p>
+        </w:tc>
+        <w:tc>
+          <w:tcPr>
+            <w:tcW w:type="dxa" w:w="3120"/>
+          </w:tcPr>
+          <w:p>
+            <w:r/>
+            <w:r>
+              <w:t>None</w:t>
+            </w:r>
+          </w:p>
+        </w:tc>
+        <w:tc>
+          <w:tcPr>
+            <w:tcW w:type="dxa" w:w="3120"/>
+          </w:tcPr>
+          <w:p>
+            <w:r/>
+            <w:r>
+              <w:t>Edits become future corrections</w:t>
+            </w:r>
+          </w:p>
+        </w:tc>
+      </w:tr>
+    </w:tbl>
+    <w:p/>
+    <w:p/>
+    <w:p>
+      <w:r>
+        <w:rPr>
+          <w:b/>
+        </w:rPr>
+        <w:t>PART III — PROFESSIONAL, ETHICAL, AND LEGAL PRACTICES</w:t>
+      </w:r>
+    </w:p>
+    <w:p/>
+    <w:p>
+      <w:r>
+        <w:rPr>
+          <w:b/>
+        </w:rPr>
+        <w:t>22. Computing as a Profession</w:t>
+      </w:r>
+    </w:p>
+    <w:p>
+      <w:r>
+        <w:t>Software development is not just a technical activity. The systems we write affect users who do not see the code, organisations that depend on the output, and sometimes the wider public. Treating it as a profession means accepting responsibility in three directions — toward the people who use the system, the data they trust us with, and the society our product becomes part of.</w:t>
+      </w:r>
+    </w:p>
+    <w:p>
+      <w:r>
+        <w:t>For our project this is not abstract. The application reads personal handwritten notes, which can include phone numbers, addresses, identity numbers, or private thoughts. Treating responsibility seriously meant we had to ask, before adding any feature: who could this hurt, and what should we put in the way?</w:t>
+      </w:r>
+    </w:p>
+    <w:p>
+      <w:r>
+        <w:rPr>
+          <w:b/>
+        </w:rPr>
+        <w:t>22.1 Ethics versus Morals</w:t>
+      </w:r>
+    </w:p>
+    <w:p>
+      <w:r>
+        <w:t>Personal morals are what an individual believes is right. Professional ethics are the standards a community of practitioners has agreed on. The two can disagree. A developer might personally see no harm in storing every image a user opens — but professional ethics, articulated in codes like ACM and IEEE, expect data minimisation and explicit consent. We followed the professional standard rather than personal convenience.</w:t>
+      </w:r>
+    </w:p>
+    <w:p>
+      <w:r>
+        <w:rPr>
+          <w:b/>
+        </w:rPr>
+        <w:t>22.2 An Honest Look at Our Own Decisions</w:t>
+      </w:r>
+    </w:p>
+    <w:p>
+      <w:r>
+        <w:t>Phase 1 took a personal-convenience shortcut: we accepted any OCR output and saved it without checking. The reasoning at the time was speed. Phase 2 corrected this. The FeedbackLoop, the privacy scan, the agent log, and the autonomy modes all add work for us as developers but reduce the chance of harm to the user. That is the trade-off professional ethics asks us to accept.</w:t>
+      </w:r>
+    </w:p>
+    <w:p/>
+    <w:p>
+      <w:r>
+        <w:rPr>
+          <w:b/>
+        </w:rPr>
+        <w:t>23. Ethical Theories and the ACM/IEEE Code</w:t>
+      </w:r>
+    </w:p>
+    <w:p>
+      <w:r>
+        <w:rPr>
+          <w:b/>
+        </w:rPr>
+        <w:t>23.1 Utilitarianism Applied</w:t>
+      </w:r>
+    </w:p>
+    <w:p>
+      <w:r>
+        <w:t>Utilitarianism judges an action by the total well-being it produces. The API escalation step in Phase 2 is a utilitarian decision in miniature. Local OCR sometimes fails badly; sending the image to a Vision API produces a much better result for the user but introduces a small privacy cost. We weighed the benefit of usable text against the cost of an external request and concluded that the trade-off is acceptable as long as it is logged, optional, and skippable in manual autonomy mode.</w:t>
+      </w:r>
+    </w:p>
+    <w:p>
+      <w:r>
+        <w:rPr>
+          <w:b/>
+        </w:rPr>
+        <w:t>23.2 Deontology Applied</w:t>
+      </w:r>
+    </w:p>
+    <w:p>
+      <w:r>
+        <w:t>Deontological ethics insists that some duties are non-negotiable regardless of outcome. Our duty toward user data falls in this category. We do not transmit images silently. We do not store extracted text indefinitely. The Clear Memory function exists because users have a right to erasure even if a more useful agent could be built by hoarding history. These are deontic constraints we placed before utilitarian optimisation.</w:t>
+      </w:r>
+    </w:p>
+    <w:p>
+      <w:r>
+        <w:rPr>
+          <w:b/>
+        </w:rPr>
+        <w:t>23.3 Human-Centred Design</w:t>
+      </w:r>
+    </w:p>
+    <w:p>
+      <w:r>
+        <w:t>Throughout Phase 2 the agent's actions are explainable, auditable, and reversible. The Agent Log shows every decision in real time. The autonomy slider lets the user choose how much control to delegate. The text panel remains editable. None of this is the most efficient design — a fully autonomous agent that ran without explanation would be faster — but human-centred design says the user comes before convenience.</w:t>
+      </w:r>
+    </w:p>
+    <w:p>
+      <w:r>
+        <w:rPr>
+          <w:b/>
+        </w:rPr>
+        <w:t>23.4 Risks of Engagement-Based Design</w:t>
+      </w:r>
+    </w:p>
+    <w:p>
+      <w:r>
+        <w:t>Many modern applications optimise for engagement rather than user benefit. Patterns like infinite scrolling, variable rewards, or push notifications that interrupt focus are well documented in research as risks to attention and well-being. We deliberately did not include any such patterns. The application opens, processes, and quits when finished. There is no streak counter, no social feed, no analytics tied to time on screen. The agent's job is to convert an image and stop.</w:t>
+      </w:r>
+    </w:p>
+    <w:p>
+      <w:r>
+        <w:rPr>
+          <w:b/>
+        </w:rPr>
+        <w:t>23.5 ACM and IEEE Code of Ethics</w:t>
+      </w:r>
+    </w:p>
+    <w:p>
+      <w:r>
+        <w:t>The ACM Code of Ethics and the IEEE Code of Ethics both emphasise honesty, public welfare, privacy, and quality of work. Three principles we followed:</w:t>
+      </w:r>
+    </w:p>
+    <w:p>
+      <w:r>
+        <w:t>Avoid harm. The Privacy Guard, the autonomy modes, and the deliberate ordering of API escalation all aim to reduce harm to users whose data passes through the system.</w:t>
+      </w:r>
+    </w:p>
+    <w:p>
+      <w:r>
+        <w:t>Be honest and trustworthy. The decision log records exactly what the agent did and why. We did not hide the API escalation behind a marketing label — when it happens, the Quality tab and Privacy tab both say so.</w:t>
+      </w:r>
+    </w:p>
+    <w:p>
+      <w:r>
+        <w:t>Maintain high standards in professional work. The Phase 1 report documented an over-processing bug we found and corrected. Phase 2 documents the 90 degree skew bug we found and corrected. Both are public admissions of mistakes; the alternative would have been to silently fix and pretend they never happened.</w:t>
+      </w:r>
+    </w:p>
+    <w:p>
+      <w:r>
+        <w:t>One principle we are partially honest about following: respect privacy. We scan extracted text for PII and warn the user, but we do not yet redact PII from the saved document automatically, and we cannot stop an image from reaching the Vision API based on its content. A more rigorous interpretation of the privacy principle would require both. We accept that this is a limitation rather than claim full compliance.</w:t>
+      </w:r>
+    </w:p>
+    <w:p/>
+    <w:p>
+      <w:r>
+        <w:rPr>
+          <w:b/>
+        </w:rPr>
+        <w:t>24. Ethical Decision-Making in Our Project</w:t>
+      </w:r>
+    </w:p>
+    <w:p>
+      <w:r>
+        <w:t>The course teaches a four-step model: identify the issue, analyse stakeholders, evaluate alternatives, justify the decision. We applied it to a real choice we faced — whether to include the API escalation at all.</w:t>
+      </w:r>
+    </w:p>
+    <w:p>
+      <w:r>
+        <w:rPr>
+          <w:b/>
+        </w:rPr>
+        <w:t>24.1 Identify the Issue</w:t>
+      </w:r>
+    </w:p>
+    <w:p>
+      <w:r>
+        <w:t>Local OCR engines fail on hard handwriting. The agent could either accept the failure, or reach for a cloud Vision API that would handle it but at a privacy cost.</w:t>
+      </w:r>
+    </w:p>
+    <w:p>
+      <w:r>
+        <w:rPr>
+          <w:b/>
+        </w:rPr>
+        <w:t>24.2 Analyse Stakeholders</w:t>
+      </w:r>
+    </w:p>
+    <w:p>
+      <w:r>
+        <w:t>Three groups are affected. The user, who wants accurate text and also expects their personal documents not to be silently uploaded. OpenAI, the API provider, who logs requests for some duration under their stated retention policy. And us as developers, who must justify whatever default we choose.</w:t>
+      </w:r>
+    </w:p>
+    <w:p>
+      <w:r>
+        <w:rPr>
+          <w:b/>
+        </w:rPr>
+        <w:t>24.3 Evaluate Alternatives</w:t>
+      </w:r>
+    </w:p>
+    <w:p>
+      <w:r>
+        <w:t>Four options were on the table. Do not include API support — loses functionality on hard inputs. Use API by default — loses privacy and makes the agent uninteresting. Use API automatically only after local fails and a quality score is below threshold — balances both. Use API only on explicit user click — safest but removes the agentic property from this part of the system.</w:t>
+      </w:r>
+    </w:p>
+    <w:p>
+      <w:r>
+        <w:rPr>
+          <w:b/>
+        </w:rPr>
+        <w:t>24.4 Justified Decision</w:t>
+      </w:r>
+    </w:p>
+    <w:p>
+      <w:r>
+        <w:t>We chose option 3, with the additional rule that the manual autonomy setting blocks the escalation entirely. The reasoning, logged in the agent's decision log on every run, is that the user already saw the local result fail (or could see it via the log), the privacy notice is logged before the request, and the user can disable the escalation without code changes by setting autonomy to manual. The alternative of refusing API entirely would have made the system useless on the very inputs that matter — handwritten notes.</w:t>
+      </w:r>
+    </w:p>
+    <w:p>
+      <w:r>
+        <w:rPr>
+          <w:b/>
+        </w:rPr>
+        <w:t>24.5 Cybersecurity Considerations</w:t>
+      </w:r>
+    </w:p>
+    <w:p>
+      <w:r>
+        <w:t>The .env file holding the OpenAI API key is gitignored. The key is read at runtime, not embedded in source. If a vulnerability in the application were ever discovered (for example a path-traversal bug while reading user-selected images), our responsible disclosure stance would be to fix it before publishing details, mirroring the practices recommended in course material.</w:t>
+      </w:r>
+    </w:p>
+    <w:p/>
+    <w:p>
+      <w:r>
+        <w:rPr>
+          <w:b/>
+        </w:rPr>
+        <w:t>25. Privacy, Data Protection, and PECA 2016</w:t>
+      </w:r>
+    </w:p>
+    <w:p>
+      <w:r>
+        <w:rPr>
+          <w:b/>
+        </w:rPr>
+        <w:t>25.1 What Data Our Application Touches</w:t>
+      </w:r>
+    </w:p>
+    <w:p>
+      <w:r>
+        <w:t>Three kinds of data pass through the system: the original image, the extracted text, and the agent's memory. The image is not stored beyond the current session. The extracted text is shown to the user, scanned for PII, and saved only if the user explicitly clicks Save. The agent's memory contains user preferences and the running list of correction patterns — never the original images themselves.</w:t>
+      </w:r>
+    </w:p>
+    <w:p>
+      <w:r>
+        <w:rPr>
+          <w:b/>
+        </w:rPr>
+        <w:t>25.2 Pakistan's PECA 2016</w:t>
+      </w:r>
+    </w:p>
+    <w:p>
+      <w:r>
+        <w:t>The Prevention of Electronic Crimes Act 2016 governs handling of personal information in Pakistan. Sections relevant to our application include unauthorised access to personal data, transmission of personal data without consent, and deceptive use of identity information. We took three steps in response. The Privacy Guard recognises Pakistani CNIC numbers explicitly and flags them. External transmission (the API escalation) requires either user opt-in via the .env key or runs in a non-manual autonomy mode, both of which are surfaced in the UI. And no data leaves the user's machine without being logged.</w:t>
+      </w:r>
+    </w:p>
+    <w:p>
+      <w:r>
+        <w:rPr>
+          <w:b/>
+        </w:rPr>
+        <w:t>25.3 GDPR Mindset</w:t>
+      </w:r>
+    </w:p>
+    <w:p>
+      <w:r>
+        <w:t>Even though we are not subject to GDPR directly, the principles are useful as a checklist. Data minimisation — we extract only what is needed and do not persist images. Purpose limitation — the data is used only for OCR. Right to erasure — the Clear Memory function deletes everything. Consent — API escalation is explicit and configurable.</w:t>
+      </w:r>
+    </w:p>
+    <w:p>
+      <w:r>
+        <w:rPr>
+          <w:b/>
+        </w:rPr>
+        <w:t>25.4 Computer Crimes the Application Could Be Misused For</w:t>
+      </w:r>
+    </w:p>
+    <w:p>
+      <w:r>
+        <w:t>Honest acknowledgement: any OCR tool can be misused to copy text out of a copyrighted scan, or to extract credentials from a screenshot the user did not have permission to read. Our system does not technically prevent that — no OCR tool can. What we can do is not store the extracted material and not forward it anywhere without consent. Both are properties our design has.</w:t>
+      </w:r>
+    </w:p>
+    <w:p/>
+    <w:p>
+      <w:r>
+        <w:rPr>
+          <w:b/>
+        </w:rPr>
+        <w:t>26. Intellectual Property and Licensing</w:t>
+      </w:r>
+    </w:p>
+    <w:p>
+      <w:r>
+        <w:rPr>
+          <w:b/>
+        </w:rPr>
+        <w:t>26.1 What We Own</w:t>
+      </w:r>
+    </w:p>
+    <w:p>
+      <w:r>
+        <w:t>The application code we wrote — the agent modules, the GUI, the preprocessing pipeline, the formatting detector, the docx generator — is our work. Under default copyright the three of us hold the rights jointly.</w:t>
+      </w:r>
+    </w:p>
+    <w:p>
+      <w:r>
+        <w:rPr>
+          <w:b/>
+        </w:rPr>
+        <w:t>26.2 What We Use Under Other Licences</w:t>
+      </w:r>
+    </w:p>
+    <w:p>
+      <w:r>
+        <w:t>Tesseract is Apache 2.0. EasyOCR is Apache 2.0. PaddleOCR is Apache 2.0. OpenCV is Apache 2.0. python-docx is MIT. PyTorch is BSD. Python and Tkinter are PSF. None of these licences restrict our use. Apache 2.0 requires us to retain the licence notices, which we have left intact in the dependency packages.</w:t>
+      </w:r>
+    </w:p>
+    <w:p>
+      <w:r>
+        <w:rPr>
+          <w:b/>
+        </w:rPr>
+        <w:t>26.3 What Licence We Would Apply</w:t>
+      </w:r>
+    </w:p>
+    <w:p>
+      <w:r>
+        <w:t>If we released this project publicly we would use the MIT licence. It is short, well understood, compatible with the permissive licences of our dependencies, and lets future students learn from our code without restrictions. We would include an attribution note for the IDIA Lab sample images and for any model weights we did not train ourselves.</w:t>
+      </w:r>
+    </w:p>
+    <w:p>
+      <w:r>
+        <w:rPr>
+          <w:b/>
+        </w:rPr>
+        <w:t>26.4 The OpenAI API and Data Use</w:t>
+      </w:r>
+    </w:p>
+    <w:p>
+      <w:r>
+        <w:t>When the agent escalates to the OpenAI Vision API, the image is transmitted to OpenAI's infrastructure. By their published policy at the time of writing, API requests are not used to train models by default. The user nonetheless cedes some degree of control over the image content for the duration of OpenAI's logging window. Our responsibility is to make this trade-off visible, which the agent log does.</w:t>
+      </w:r>
+    </w:p>
+    <w:p/>
+    <w:p>
+      <w:r>
+        <w:rPr>
+          <w:b/>
+        </w:rPr>
+        <w:t>27. Industry Practices, Trends, and Career Relevance</w:t>
+      </w:r>
+    </w:p>
+    <w:p>
+      <w:r>
+        <w:rPr>
+          <w:b/>
+        </w:rPr>
+        <w:t>27.1 Student Project versus Software House Workflow</w:t>
+      </w:r>
+    </w:p>
+    <w:p>
+      <w:r>
+        <w:t>A working software house would have done several things differently from us. They would have set up CI to run automated tests on every commit. They would track issues in a shared tool — Linear or Jira — rather than in conversations. They would conduct code reviews before merging. They would release behind a feature flag. They would have a staging environment separate from production.</w:t>
+      </w:r>
+    </w:p>
+    <w:p>
+      <w:r>
+        <w:t>We did some of these. We used Git for version control with meaningful commit messages. We tested before shipping. We kept Phase 1 runnable so we could compare against Phase 2 — a form of fallback that mirrors a feature flag. The gap between what we did and what an industry team would do is process-related rather than technical, and we are aware of it.</w:t>
+      </w:r>
+    </w:p>
+    <w:p>
+      <w:r>
+        <w:rPr>
+          <w:b/>
+        </w:rPr>
+        <w:t>27.2 The Trend Toward Agentic Systems</w:t>
+      </w:r>
+    </w:p>
+    <w:p>
+      <w:r>
+        <w:t>The industry shift visible in 2025 and 2026 is from static applications toward agentic ones — systems that perceive, reason, decide, and act with increasing autonomy. Production examples include code assistants that plan and implement multi-file edits, customer support agents that triage and resolve cases, and operational agents that monitor infrastructure. The architecture pattern in our project — perception, decision, action, feedback, memory — is the same pattern that appears in those production systems, scaled up.</w:t>
+      </w:r>
+    </w:p>
+    <w:p>
+      <w:r>
+        <w:rPr>
+          <w:b/>
+        </w:rPr>
+        <w:t>27.3 What This Project Taught Us About Careers</w:t>
+      </w:r>
+    </w:p>
+    <w:p>
+      <w:r>
+        <w:t>Three skills became concrete for us through this project. First, AI is no longer separable from software engineering — the boundary between writing code and integrating models is thinning, and the engineer who can do both is more useful than one who can only do one. Second, ethical thinking is now a delivery skill, not a separate course — every autonomy decision we made in the agent design was an ethical decision. Third, transparency and logging are no longer optional features — they are how complex systems are debugged, audited, and trusted.</w:t>
+      </w:r>
+    </w:p>
+    <w:p>
+      <w:r>
+        <w:rPr>
+          <w:b/>
+        </w:rPr>
+        <w:t>27.4 Virtual Work and Sustainability</w:t>
+      </w:r>
+    </w:p>
+    <w:p>
+      <w:r>
+        <w:t>The three of us collaborated remotely for part of this project. Tools like Git, shared documents, and async messaging let us work without being in the same room, but they also stretched the working day if we were not careful. We learned to set explicit handoff times rather than letting the project run continuously. On sustainability, all of our OCR engines run on CPU, which is much less power-hungry than training large models. The Vision API escalation runs on OpenAI's hardware only when needed; the local-first ordering is also a green-computing decision, not just a privacy one.</w:t>
+      </w:r>
+    </w:p>
+    <w:p/>
+    <w:p>
+      <w:r>
+        <w:rPr>
+          <w:b/>
+        </w:rPr>
+        <w:t>28. Risk Assessment and Safety Mechanisms</w:t>
+      </w:r>
+    </w:p>
+    <w:p>
+      <w:r>
+        <w:rPr>
+          <w:b/>
+        </w:rPr>
+        <w:t>28.1 Risks We Identified</w:t>
+      </w:r>
+    </w:p>
+    <w:tbl>
+      <w:tblPr>
+        <w:tblW w:type="auto" w:w="0"/>
+        <w:tblLook w:firstColumn="1" w:firstRow="1" w:lastColumn="0" w:lastRow="0" w:noHBand="0" w:noVBand="1" w:val="04A0"/>
+        <w:tblBorders>
+          <w:top w:val="single" w:sz="4" w:space="0" w:color="000000"/>
+          <w:left w:val="single" w:sz="4" w:space="0" w:color="000000"/>
+          <w:bottom w:val="single" w:sz="4" w:space="0" w:color="000000"/>
+          <w:right w:val="single" w:sz="4" w:space="0" w:color="000000"/>
+          <w:insideH w:val="single" w:sz="4" w:space="0" w:color="000000"/>
+          <w:insideV w:val="single" w:sz="4" w:space="0" w:color="000000"/>
+        </w:tblBorders>
+      </w:tblPr>
+      <w:tblGrid>
+        <w:gridCol w:w="2340"/>
+        <w:gridCol w:w="2340"/>
+        <w:gridCol w:w="2340"/>
+        <w:gridCol w:w="2340"/>
+      </w:tblGrid>
+      <w:tr>
+        <w:tc>
+          <w:tcPr>
+            <w:tcW w:type="dxa" w:w="2340"/>
+          </w:tcPr>
+          <w:p>
+            <w:r/>
+            <w:r>
+              <w:rPr>
+                <w:b/>
+              </w:rPr>
+              <w:t>Risk</w:t>
+            </w:r>
+          </w:p>
+        </w:tc>
+        <w:tc>
+          <w:tcPr>
+            <w:tcW w:type="dxa" w:w="2340"/>
+          </w:tcPr>
+          <w:p>
+            <w:r/>
+            <w:r>
+              <w:rPr>
+                <w:b/>
+              </w:rPr>
+              <w:t>Likelihood</w:t>
+            </w:r>
+          </w:p>
+        </w:tc>
+        <w:tc>
+          <w:tcPr>
+            <w:tcW w:type="dxa" w:w="2340"/>
+          </w:tcPr>
+          <w:p>
+            <w:r/>
+            <w:r>
+              <w:rPr>
+                <w:b/>
+              </w:rPr>
+              <w:t>Impact</w:t>
+            </w:r>
+          </w:p>
+        </w:tc>
+        <w:tc>
+          <w:tcPr>
+            <w:tcW w:type="dxa" w:w="2340"/>
+          </w:tcPr>
+          <w:p>
+            <w:r/>
+            <w:r>
+              <w:rPr>
+                <w:b/>
+              </w:rPr>
+              <w:t>Mitigation</w:t>
+            </w:r>
+          </w:p>
+        </w:tc>
+      </w:tr>
+      <w:tr>
+        <w:tc>
+          <w:tcPr>
+            <w:tcW w:type="dxa" w:w="2340"/>
+          </w:tcPr>
+          <w:p>
+            <w:r/>
+            <w:r>
+              <w:t>Wrong OCR auto-decision</w:t>
+            </w:r>
+          </w:p>
+        </w:tc>
+        <w:tc>
+          <w:tcPr>
+            <w:tcW w:type="dxa" w:w="2340"/>
+          </w:tcPr>
+          <w:p>
+            <w:r/>
+            <w:r>
+              <w:t>Medium</w:t>
+            </w:r>
+          </w:p>
+        </w:tc>
+        <w:tc>
+          <w:tcPr>
+            <w:tcW w:type="dxa" w:w="2340"/>
+          </w:tcPr>
+          <w:p>
+            <w:r/>
+            <w:r>
+              <w:t>Low</w:t>
+            </w:r>
+          </w:p>
+        </w:tc>
+        <w:tc>
+          <w:tcPr>
+            <w:tcW w:type="dxa" w:w="2340"/>
+          </w:tcPr>
+          <w:p>
+            <w:r/>
+            <w:r>
+              <w:t>Quality check, retry, user can review and edit</w:t>
+            </w:r>
+          </w:p>
+        </w:tc>
+      </w:tr>
+      <w:tr>
+        <w:tc>
+          <w:tcPr>
+            <w:tcW w:type="dxa" w:w="2340"/>
+          </w:tcPr>
+          <w:p>
+            <w:r/>
+            <w:r>
+              <w:t>Saving without review</w:t>
+            </w:r>
+          </w:p>
+        </w:tc>
+        <w:tc>
+          <w:tcPr>
+            <w:tcW w:type="dxa" w:w="2340"/>
+          </w:tcPr>
+          <w:p>
+            <w:r/>
+            <w:r>
+              <w:t>Low</w:t>
+            </w:r>
+          </w:p>
+        </w:tc>
+        <w:tc>
+          <w:tcPr>
+            <w:tcW w:type="dxa" w:w="2340"/>
+          </w:tcPr>
+          <w:p>
+            <w:r/>
+            <w:r>
+              <w:t>Medium</w:t>
+            </w:r>
+          </w:p>
+        </w:tc>
+        <w:tc>
+          <w:tcPr>
+            <w:tcW w:type="dxa" w:w="2340"/>
+          </w:tcPr>
+          <w:p>
+            <w:r/>
+            <w:r>
+              <w:t>Save requires user click, PII triggers a warning</w:t>
+            </w:r>
+          </w:p>
+        </w:tc>
+      </w:tr>
+      <w:tr>
+        <w:tc>
+          <w:tcPr>
+            <w:tcW w:type="dxa" w:w="2340"/>
+          </w:tcPr>
+          <w:p>
+            <w:r/>
+            <w:r>
+              <w:t>PII exposure</w:t>
+            </w:r>
+          </w:p>
+        </w:tc>
+        <w:tc>
+          <w:tcPr>
+            <w:tcW w:type="dxa" w:w="2340"/>
+          </w:tcPr>
+          <w:p>
+            <w:r/>
+            <w:r>
+              <w:t>Medium</w:t>
+            </w:r>
+          </w:p>
+        </w:tc>
+        <w:tc>
+          <w:tcPr>
+            <w:tcW w:type="dxa" w:w="2340"/>
+          </w:tcPr>
+          <w:p>
+            <w:r/>
+            <w:r>
+              <w:t>High</w:t>
+            </w:r>
+          </w:p>
+        </w:tc>
+        <w:tc>
+          <w:tcPr>
+            <w:tcW w:type="dxa" w:w="2340"/>
+          </w:tcPr>
+          <w:p>
+            <w:r/>
+            <w:r>
+              <w:t>Privacy Guard warning, manual autonomy blocks API</w:t>
+            </w:r>
+          </w:p>
+        </w:tc>
+      </w:tr>
+      <w:tr>
+        <w:tc>
+          <w:tcPr>
+            <w:tcW w:type="dxa" w:w="2340"/>
+          </w:tcPr>
+          <w:p>
+            <w:r/>
+            <w:r>
+              <w:t>Image sent to API silently</w:t>
+            </w:r>
+          </w:p>
+        </w:tc>
+        <w:tc>
+          <w:tcPr>
+            <w:tcW w:type="dxa" w:w="2340"/>
+          </w:tcPr>
+          <w:p>
+            <w:r/>
+            <w:r>
+              <w:t>Low</w:t>
+            </w:r>
+          </w:p>
+        </w:tc>
+        <w:tc>
+          <w:tcPr>
+            <w:tcW w:type="dxa" w:w="2340"/>
+          </w:tcPr>
+          <w:p>
+            <w:r/>
+            <w:r>
+              <w:t>High</w:t>
+            </w:r>
+          </w:p>
+        </w:tc>
+        <w:tc>
+          <w:tcPr>
+            <w:tcW w:type="dxa" w:w="2340"/>
+          </w:tcPr>
+          <w:p>
+            <w:r/>
+            <w:r>
+              <w:t>Logged before request, blocked in manual mode</w:t>
+            </w:r>
+          </w:p>
+        </w:tc>
+      </w:tr>
+      <w:tr>
+        <w:tc>
+          <w:tcPr>
+            <w:tcW w:type="dxa" w:w="2340"/>
+          </w:tcPr>
+          <w:p>
+            <w:r/>
+            <w:r>
+              <w:t>Agent learns wrong corrections</w:t>
+            </w:r>
+          </w:p>
+        </w:tc>
+        <w:tc>
+          <w:tcPr>
+            <w:tcW w:type="dxa" w:w="2340"/>
+          </w:tcPr>
+          <w:p>
+            <w:r/>
+            <w:r>
+              <w:t>Low</w:t>
+            </w:r>
+          </w:p>
+        </w:tc>
+        <w:tc>
+          <w:tcPr>
+            <w:tcW w:type="dxa" w:w="2340"/>
+          </w:tcPr>
+          <w:p>
+            <w:r/>
+            <w:r>
+              <w:t>Low</w:t>
+            </w:r>
+          </w:p>
+        </w:tc>
+        <w:tc>
+          <w:tcPr>
+            <w:tcW w:type="dxa" w:w="2340"/>
+          </w:tcPr>
+          <w:p>
+            <w:r/>
+            <w:r>
+              <w:t>User can clear memory at any time</w:t>
+            </w:r>
+          </w:p>
+        </w:tc>
+      </w:tr>
+      <w:tr>
+        <w:tc>
+          <w:tcPr>
+            <w:tcW w:type="dxa" w:w="2340"/>
+          </w:tcPr>
+          <w:p>
+            <w:r/>
+            <w:r>
+              <w:t>Pipeline failure</w:t>
+            </w:r>
+          </w:p>
+        </w:tc>
+        <w:tc>
+          <w:tcPr>
+            <w:tcW w:type="dxa" w:w="2340"/>
+          </w:tcPr>
+          <w:p>
+            <w:r/>
+            <w:r>
+              <w:t>Low</w:t>
+            </w:r>
+          </w:p>
+        </w:tc>
+        <w:tc>
+          <w:tcPr>
+            <w:tcW w:type="dxa" w:w="2340"/>
+          </w:tcPr>
+          <w:p>
+            <w:r/>
+            <w:r>
+              <w:t>Medium</w:t>
+            </w:r>
+          </w:p>
+        </w:tc>
+        <w:tc>
+          <w:tcPr>
+            <w:tcW w:type="dxa" w:w="2340"/>
+          </w:tcPr>
+          <w:p>
+            <w:r/>
+            <w:r>
+              <w:t>Phase 1 fallback still available</w:t>
+            </w:r>
+          </w:p>
+        </w:tc>
+      </w:tr>
+    </w:tbl>
+    <w:p/>
+    <w:p>
+      <w:r>
+        <w:rPr>
+          <w:b/>
+        </w:rPr>
+        <w:t>28.2 Safety Mechanisms in the Code</w:t>
+      </w:r>
+    </w:p>
+    <w:p>
+      <w:r>
+        <w:t>Decision logging — every action records timestamp, agent, reasoning, alternatives, confidence, and outcome. Risk classification — actions are tagged low, medium, or high; the SafetyGuard module enforces what the current autonomy level allows. Human-in-the-loop — saving, applying corrections, and using the API are all medium risk and respect the autonomy slider. Memory audit — users can read or wipe everything stored. Phase 1 fallback — the original static pipeline is one command line away, so if the agent behaves badly we have somewhere to go.</w:t>
+      </w:r>
+    </w:p>
+    <w:p/>
+    <w:p>
+      <w:pPr>
+        <w:rPr>
+          <w:b/>
+          <w:bCs/>
+        </w:rPr>
+      </w:pPr>
+      <w:r>
+        <w:rPr>
+          <w:b/>
+          <w:bCs/>
+        </w:rPr>
+        <w:t>29. Conclusion</w:t>
+      </w:r>
+    </w:p>
+    <w:p>
+      <w:r>
+        <w:t>We built and then transformed an Image-to-Word converter across two project phases. Phase 1 produced a working desktop application that takes a JPG or PNG, preprocesses it, runs OCR through EasyOCR with Tesseract as fallback, detects basic formatting, and writes a properly structured .docx file. We benchmarked five OCR engines and documented why EasyOCR was the right default. We also documented an over-processing bug in our preprocessing pipeline that we found and fixed mid-development.</w:t>
+      </w:r>
+    </w:p>
+    <w:p>
+      <w:r>
+        <w:t>Phase 2 wrapped that working tool in an agentic layer of eight modules — perception, decision, action, evaluation, memory, logging, safety, and privacy — all coordinated by an Orchestrator implementing the Observe-Decide-Act-Learn cycle. The agent now selects its own engine, adapts its preprocessing, evaluates its own output, retries with a different strategy when it fails, escalates to a Vision API as a last resort, scans for PII, logs every decision, and learns correction patterns from user edits. The original Phase 1 code remained untouched throughout — running python main.py --phase1 still launches the static tool exactly as it shipped.</w:t>
+      </w:r>
+    </w:p>
+    <w:p>
+      <w:r>
+        <w:t>The agentic transformation was not just a technical exercise. Each design choice carried a professional or ethical weight that we tried to acknowledge openly. The API escalation was a utilitarian trade-off between accuracy and privacy. The autonomy slider was a deontological constraint placing user control above developer convenience. The decision log was an honesty commitment. The Privacy Guard was an explicit response to PECA 2016 obligations around personal data. We did not always reach the strictest interpretation of every principle — the Privacy Guard's API notice is a log entry rather than a blocker, and we said so rather than hide it.</w:t>
+      </w:r>
+    </w:p>
+    <w:p>
+      <w:r>
+        <w:t>Two real bugs we documented are worth highlighting because they were caught by the system itself. In Phase 1 we noticed that adaptive thresholding on JPEG-compressed phone photos was producing nonsense output, and we replaced that step with lighter denoising and sharpening. In Phase 2 the FeedbackLoop's consistent 0.00 score on a clean image led us to a 90 degree skew misdetection caused by an OpenCV version-compatibility issue, which we fixed by normalising the angle and rejecting implausible values. Both fixes show what self-evaluating systems are for — finding problems that a static pipeline would have shipped.</w:t>
+      </w:r>
+    </w:p>
+    <w:p>
+      <w:r>
+        <w:t>What this project taught us as students is concrete. AI capability is now an engineering skill, not a specialty. Ethical reasoning is part of design, not a separate review step. Logging and explainability are how complex systems are debugged and trusted. And finishing a project honestly — including writing down the bugs we found and the limitations we did not solve — is more useful than presenting a polished but partial story.</w:t>
+      </w:r>
+    </w:p>
+    <w:p>
+      <w:r>
+        <w:t>The application is functional, the agentic layer is genuine rather than decorative, and the documentation reflects what we actually built. We submit this report as the record of our work for the Professional Practices in IT final project.</w:t>
+      </w:r>
+    </w:p>
     <w:sectPr>
       <w:pgSz w:w="12240" w:h="15840"/>
       <w:pgMar w:top="1440" w:right="1440" w:bottom="1440" w:left="1440" w:header="720" w:footer="720" w:gutter="0"/>

</xml_diff>